<commit_message>
feat(courseware): chuẩn hóa không gian học liệu và phát hành trọn bộ S01-S09
- Tái cấu trúc không gian học liệu: tích hợp slide Beamer ĐHBK chuẩn vào từng buổi học S01-S09
- Phát hành Tài liệu học tập 46 trang (PDF, HTML, DOCX) theo nhận diện thương hiệu HCMUT
- Tích hợp tài liệu hướng dẫn README.md chi tiết cho học viên lớp CHAT4P
- Làm sạch toàn bộ tệp phụ trợ biên dịch và chuẩn hóa danh mục đồ án nhóm
- Cập nhật quy chế đánh giá và khớp biểu mẫu Khảo thí & ĐBCLĐT

Giảng viên phụ trách: Nguyễn An Khương (CSE-HCMUT · ORCID: 0000-0002-9910-6387)
Trợ giảng học phần: Nguyễn Hữu Hoàng Huy (HuyLHP)
Authored-by: nakhuong <nakhuong@gmail.com>
</commit_message>
<xml_diff>
--- a/Do-an-nhom/RUBRIC-DANH-GIA-DO-AN-CHUYEN-DE.docx
+++ b/Do-an-nhom/RUBRIC-DANH-GIA-DO-AN-CHUYEN-DE.docx
@@ -2,7 +2,7 @@
 <file path=word/document.xml><?xml version="1.0" encoding="utf-8"?>
 <w:document xmlns:w="http://schemas.openxmlformats.org/wordprocessingml/2006/main" xmlns:m="http://schemas.openxmlformats.org/officeDocument/2006/math" xmlns:r="http://schemas.openxmlformats.org/officeDocument/2006/relationships" xmlns:o="urn:schemas-microsoft-com:office:office" xmlns:v="urn:schemas-microsoft-com:vml" xmlns:w10="urn:schemas-microsoft-com:office:word" xmlns:a="http://schemas.openxmlformats.org/drawingml/2006/main" xmlns:pic="http://schemas.openxmlformats.org/drawingml/2006/picture" xmlns:wp="http://schemas.openxmlformats.org/drawingml/2006/wordprocessingDrawing">
   <w:body>
-    <w:bookmarkStart w:id="12" w:name="X19145735b52078d06ef0d4e6754a7860e546bc6"/>
+    <w:bookmarkStart w:id="13" w:name="X19145735b52078d06ef0d4e6754a7860e546bc6"/>
     <w:p>
       <w:pPr>
         <w:pStyle w:val="Heading1"/>
@@ -42,7 +42,21 @@
         <w:t xml:space="preserve"> </w:t>
       </w:r>
       <w:r>
-        <w:t xml:space="preserve">Nguyễn An Khương (Khoa Khoa học &amp; Kỹ thuật Máy tính, Trường ĐHBK Tp. HCM)</w:t>
+        <w:t xml:space="preserve">Nguyễn An Khương (Khoa Khoa học &amp; Kỹ thuật Máy tính, Trường ĐHBK Tp. HCM ·</w:t>
+      </w:r>
+      <w:r>
+        <w:t xml:space="preserve"> </w:t>
+      </w:r>
+      <w:hyperlink r:id="rId9">
+        <w:r>
+          <w:rPr>
+            <w:rStyle w:val="Hyperlink"/>
+          </w:rPr>
+          <w:t xml:space="preserve">ORCID: 0000-0002-9910-6387</w:t>
+        </w:r>
+      </w:hyperlink>
+      <w:r>
+        <w:t xml:space="preserve">)</w:t>
       </w:r>
       <w:r>
         <w:br/>
@@ -100,7 +114,7 @@
         </w:pict>
       </w:r>
     </w:p>
-    <w:bookmarkStart w:id="9" w:name="bảng-tiêu-chí-đánh-giá-chi-tiết"/>
+    <w:bookmarkStart w:id="10" w:name="bảng-tiêu-chí-đánh-giá-chi-tiết"/>
     <w:p>
       <w:pPr>
         <w:pStyle w:val="Heading2"/>
@@ -481,8 +495,8 @@
         </w:pict>
       </w:r>
     </w:p>
-    <w:bookmarkEnd w:id="9"/>
-    <w:bookmarkStart w:id="10" w:name="quy-trình-bảo-vệ-chuẩn-30-phút-nhóm"/>
+    <w:bookmarkEnd w:id="10"/>
+    <w:bookmarkStart w:id="11" w:name="quy-trình-bảo-vệ-chuẩn-30-phút-nhóm"/>
     <w:p>
       <w:pPr>
         <w:pStyle w:val="Heading2"/>
@@ -602,8 +616,8 @@
         </w:pict>
       </w:r>
     </w:p>
-    <w:bookmarkEnd w:id="10"/>
-    <w:bookmarkStart w:id="11" w:name="X10c57d9b21bf2276250124e948715c7cf188c34"/>
+    <w:bookmarkEnd w:id="11"/>
+    <w:bookmarkStart w:id="12" w:name="X10c57d9b21bf2276250124e948715c7cf188c34"/>
     <w:p>
       <w:pPr>
         <w:pStyle w:val="Heading2"/>
@@ -680,8 +694,8 @@
         <w:t xml:space="preserve">Học viên đặt câu hỏi phản biện có chất lượng chuyên môn cao sẽ được cộng điểm chuyên cần/thưởng trực tiếp vào điểm cá nhân.</w:t>
       </w:r>
     </w:p>
-    <w:bookmarkEnd w:id="11"/>
     <w:bookmarkEnd w:id="12"/>
+    <w:bookmarkEnd w:id="13"/>
     <w:sectPr>
       <w:footnotePr>
         <w:numRestart w:val="eachSect"/>

</xml_diff>